<commit_message>
adding all files/folders to repository @6-5-26 :12:54:PM
</commit_message>
<xml_diff>
--- a/HTML_CSS.docx
+++ b/HTML_CSS.docx
@@ -973,260 +973,315 @@
         </w:rPr>
         <w:t>&lt;/style&gt;</w:t>
       </w:r>
+    </w:p>
+    <w:p>
+      <w:pPr>
+        <w:rPr>
+          <w:sz w:val="28"/>
+          <w:lang w:val="en-US"/>
+        </w:rPr>
+      </w:pPr>
+      <w:r>
+        <w:rPr>
+          <w:sz w:val="28"/>
+          <w:lang w:val="en-US"/>
+        </w:rPr>
+        <w:lastRenderedPageBreak/>
+        <w:t xml:space="preserve">&lt;link </w:t>
+      </w:r>
+      <w:proofErr w:type="spellStart"/>
+      <w:r>
+        <w:rPr>
+          <w:sz w:val="28"/>
+          <w:lang w:val="en-US"/>
+        </w:rPr>
+        <w:t>rel</w:t>
+      </w:r>
+      <w:proofErr w:type="spellEnd"/>
+      <w:r>
+        <w:rPr>
+          <w:sz w:val="28"/>
+          <w:lang w:val="en-US"/>
+        </w:rPr>
+        <w:t xml:space="preserve">=”” </w:t>
+      </w:r>
+      <w:proofErr w:type="spellStart"/>
+      <w:r>
+        <w:rPr>
+          <w:sz w:val="28"/>
+          <w:lang w:val="en-US"/>
+        </w:rPr>
+        <w:t>href</w:t>
+      </w:r>
+      <w:proofErr w:type="spellEnd"/>
+      <w:r>
+        <w:rPr>
+          <w:sz w:val="28"/>
+          <w:lang w:val="en-US"/>
+        </w:rPr>
+        <w:t>=”’ /&gt;</w:t>
+      </w:r>
+    </w:p>
+    <w:p>
+      <w:pPr>
+        <w:rPr>
+          <w:sz w:val="28"/>
+          <w:lang w:val="en-US"/>
+        </w:rPr>
+      </w:pPr>
+      <w:r>
+        <w:rPr>
+          <w:sz w:val="28"/>
+          <w:lang w:val="en-US"/>
+        </w:rPr>
+        <w:t>&lt;</w:t>
+      </w:r>
+      <w:proofErr w:type="spellStart"/>
+      <w:r>
+        <w:rPr>
+          <w:sz w:val="28"/>
+          <w:lang w:val="en-US"/>
+        </w:rPr>
+        <w:t>faviicon</w:t>
+      </w:r>
+      <w:proofErr w:type="spellEnd"/>
+    </w:p>
+    <w:p>
+      <w:pPr>
+        <w:rPr>
+          <w:sz w:val="28"/>
+          <w:lang w:val="en-US"/>
+        </w:rPr>
+      </w:pPr>
+      <w:r>
+        <w:rPr>
+          <w:sz w:val="28"/>
+          <w:lang w:val="en-US"/>
+        </w:rPr>
+        <w:tab/>
+        <w:t>&lt;/head&gt;</w:t>
+      </w:r>
+    </w:p>
+    <w:p>
+      <w:pPr>
+        <w:rPr>
+          <w:sz w:val="28"/>
+          <w:lang w:val="en-US"/>
+        </w:rPr>
+      </w:pPr>
+      <w:r>
+        <w:rPr>
+          <w:sz w:val="28"/>
+          <w:lang w:val="en-US"/>
+        </w:rPr>
+        <w:tab/>
+        <w:t>&lt;</w:t>
+      </w:r>
+      <w:proofErr w:type="gramStart"/>
+      <w:r>
+        <w:rPr>
+          <w:sz w:val="28"/>
+          <w:lang w:val="en-US"/>
+        </w:rPr>
+        <w:t>body</w:t>
+      </w:r>
+      <w:proofErr w:type="gramEnd"/>
+      <w:r>
+        <w:rPr>
+          <w:sz w:val="28"/>
+          <w:lang w:val="en-US"/>
+        </w:rPr>
+        <w:t>&gt;</w:t>
+      </w:r>
+    </w:p>
+    <w:p>
+      <w:pPr>
+        <w:rPr>
+          <w:sz w:val="28"/>
+          <w:lang w:val="en-US"/>
+        </w:rPr>
+      </w:pPr>
+      <w:r>
+        <w:rPr>
+          <w:sz w:val="28"/>
+          <w:lang w:val="en-US"/>
+        </w:rPr>
+        <w:t xml:space="preserve">All tag written here </w:t>
+      </w:r>
+      <w:proofErr w:type="gramStart"/>
+      <w:r>
+        <w:rPr>
+          <w:sz w:val="28"/>
+          <w:lang w:val="en-US"/>
+        </w:rPr>
+        <w:t>are</w:t>
+      </w:r>
+      <w:proofErr w:type="gramEnd"/>
+      <w:r>
+        <w:rPr>
+          <w:sz w:val="28"/>
+          <w:lang w:val="en-US"/>
+        </w:rPr>
+        <w:t xml:space="preserve"> displayed to user. </w:t>
+      </w:r>
+    </w:p>
+    <w:p>
+      <w:pPr>
+        <w:rPr>
+          <w:sz w:val="28"/>
+          <w:lang w:val="en-US"/>
+        </w:rPr>
+      </w:pPr>
+      <w:r>
+        <w:rPr>
+          <w:sz w:val="28"/>
+          <w:lang w:val="en-US"/>
+        </w:rPr>
+        <w:tab/>
+        <w:t>&lt;/body&gt;</w:t>
+      </w:r>
+    </w:p>
+    <w:p>
+      <w:pPr>
+        <w:rPr>
+          <w:sz w:val="28"/>
+          <w:lang w:val="en-US"/>
+        </w:rPr>
+      </w:pPr>
+      <w:r>
+        <w:rPr>
+          <w:sz w:val="28"/>
+          <w:lang w:val="en-US"/>
+        </w:rPr>
+        <w:t xml:space="preserve">&lt;/html&gt; </w:t>
+      </w:r>
+    </w:p>
+    <w:p>
+      <w:pPr>
+        <w:rPr>
+          <w:sz w:val="28"/>
+          <w:lang w:val="en-US"/>
+        </w:rPr>
+      </w:pPr>
+      <w:r>
+        <w:rPr>
+          <w:sz w:val="28"/>
+          <w:lang w:val="en-US"/>
+        </w:rPr>
+        <w:t>&lt;</w:t>
+      </w:r>
+      <w:proofErr w:type="gramStart"/>
+      <w:r>
+        <w:rPr>
+          <w:sz w:val="28"/>
+          <w:lang w:val="en-US"/>
+        </w:rPr>
+        <w:t>script</w:t>
+      </w:r>
+      <w:proofErr w:type="gramEnd"/>
+      <w:r>
+        <w:rPr>
+          <w:sz w:val="28"/>
+          <w:lang w:val="en-US"/>
+        </w:rPr>
+        <w:t>&gt;&lt;/script&gt;</w:t>
+      </w:r>
+    </w:p>
+    <w:p>
+      <w:pPr>
+        <w:rPr>
+          <w:sz w:val="28"/>
+          <w:lang w:val="en-US"/>
+        </w:rPr>
+      </w:pPr>
+      <w:r>
+        <w:rPr>
+          <w:sz w:val="28"/>
+          <w:lang w:val="en-US"/>
+        </w:rPr>
+        <w:t xml:space="preserve">&lt;script </w:t>
+      </w:r>
+      <w:proofErr w:type="spellStart"/>
+      <w:r>
+        <w:rPr>
+          <w:sz w:val="28"/>
+          <w:lang w:val="en-US"/>
+        </w:rPr>
+        <w:t>src</w:t>
+      </w:r>
+      <w:proofErr w:type="spellEnd"/>
+      <w:r>
+        <w:rPr>
+          <w:sz w:val="28"/>
+          <w:lang w:val="en-US"/>
+        </w:rPr>
+        <w:t>=””&gt;&lt;/script&gt;</w:t>
+      </w:r>
+    </w:p>
+    <w:p>
+      <w:pPr>
+        <w:rPr>
+          <w:sz w:val="28"/>
+          <w:lang w:val="en-US"/>
+        </w:rPr>
+      </w:pPr>
+    </w:p>
+    <w:p>
+      <w:pPr>
+        <w:rPr>
+          <w:sz w:val="28"/>
+          <w:lang w:val="en-US"/>
+        </w:rPr>
+      </w:pPr>
+      <w:r>
+        <w:rPr>
+          <w:sz w:val="28"/>
+          <w:lang w:val="en-US"/>
+        </w:rPr>
+        <w:t xml:space="preserve">Todays’ we are learning </w:t>
+      </w:r>
+      <w:proofErr w:type="spellStart"/>
+      <w:r>
+        <w:rPr>
+          <w:sz w:val="28"/>
+          <w:lang w:val="en-US"/>
+        </w:rPr>
+        <w:t>git</w:t>
+      </w:r>
+      <w:proofErr w:type="spellEnd"/>
+      <w:r>
+        <w:rPr>
+          <w:sz w:val="28"/>
+          <w:lang w:val="en-US"/>
+        </w:rPr>
+        <w:t xml:space="preserve"> and </w:t>
+      </w:r>
+      <w:proofErr w:type="spellStart"/>
+      <w:r>
+        <w:rPr>
+          <w:sz w:val="28"/>
+          <w:lang w:val="en-US"/>
+        </w:rPr>
+        <w:t>git</w:t>
+      </w:r>
+      <w:proofErr w:type="spellEnd"/>
+      <w:r>
+        <w:rPr>
+          <w:sz w:val="28"/>
+          <w:lang w:val="en-US"/>
+        </w:rPr>
+        <w:t xml:space="preserve"> bash</w:t>
+      </w:r>
+    </w:p>
+    <w:p>
+      <w:pPr>
+        <w:rPr>
+          <w:sz w:val="28"/>
+          <w:lang w:val="en-US"/>
+        </w:rPr>
+      </w:pPr>
       <w:bookmarkStart w:id="0" w:name="_GoBack"/>
       <w:bookmarkEnd w:id="0"/>
-    </w:p>
-    <w:p>
-      <w:pPr>
-        <w:rPr>
-          <w:sz w:val="28"/>
-          <w:lang w:val="en-US"/>
-        </w:rPr>
-      </w:pPr>
-      <w:r>
-        <w:rPr>
-          <w:sz w:val="28"/>
-          <w:lang w:val="en-US"/>
-        </w:rPr>
-        <w:lastRenderedPageBreak/>
-        <w:t xml:space="preserve">&lt;link </w:t>
-      </w:r>
-      <w:proofErr w:type="spellStart"/>
-      <w:r>
-        <w:rPr>
-          <w:sz w:val="28"/>
-          <w:lang w:val="en-US"/>
-        </w:rPr>
-        <w:t>rel</w:t>
-      </w:r>
-      <w:proofErr w:type="spellEnd"/>
-      <w:r>
-        <w:rPr>
-          <w:sz w:val="28"/>
-          <w:lang w:val="en-US"/>
-        </w:rPr>
-        <w:t xml:space="preserve">=”” </w:t>
-      </w:r>
-      <w:proofErr w:type="spellStart"/>
-      <w:r>
-        <w:rPr>
-          <w:sz w:val="28"/>
-          <w:lang w:val="en-US"/>
-        </w:rPr>
-        <w:t>href</w:t>
-      </w:r>
-      <w:proofErr w:type="spellEnd"/>
-      <w:r>
-        <w:rPr>
-          <w:sz w:val="28"/>
-          <w:lang w:val="en-US"/>
-        </w:rPr>
-        <w:t>=”’ /&gt;</w:t>
-      </w:r>
-    </w:p>
-    <w:p>
-      <w:pPr>
-        <w:rPr>
-          <w:sz w:val="28"/>
-          <w:lang w:val="en-US"/>
-        </w:rPr>
-      </w:pPr>
-      <w:r>
-        <w:rPr>
-          <w:sz w:val="28"/>
-          <w:lang w:val="en-US"/>
-        </w:rPr>
-        <w:t>&lt;</w:t>
-      </w:r>
-      <w:proofErr w:type="spellStart"/>
-      <w:r>
-        <w:rPr>
-          <w:sz w:val="28"/>
-          <w:lang w:val="en-US"/>
-        </w:rPr>
-        <w:t>faviicon</w:t>
-      </w:r>
-      <w:proofErr w:type="spellEnd"/>
-    </w:p>
-    <w:p>
-      <w:pPr>
-        <w:rPr>
-          <w:sz w:val="28"/>
-          <w:lang w:val="en-US"/>
-        </w:rPr>
-      </w:pPr>
-      <w:r>
-        <w:rPr>
-          <w:sz w:val="28"/>
-          <w:lang w:val="en-US"/>
-        </w:rPr>
-        <w:tab/>
-        <w:t>&lt;/head&gt;</w:t>
-      </w:r>
-    </w:p>
-    <w:p>
-      <w:pPr>
-        <w:rPr>
-          <w:sz w:val="28"/>
-          <w:lang w:val="en-US"/>
-        </w:rPr>
-      </w:pPr>
-      <w:r>
-        <w:rPr>
-          <w:sz w:val="28"/>
-          <w:lang w:val="en-US"/>
-        </w:rPr>
-        <w:tab/>
-        <w:t>&lt;</w:t>
-      </w:r>
-      <w:proofErr w:type="gramStart"/>
-      <w:r>
-        <w:rPr>
-          <w:sz w:val="28"/>
-          <w:lang w:val="en-US"/>
-        </w:rPr>
-        <w:t>body</w:t>
-      </w:r>
-      <w:proofErr w:type="gramEnd"/>
-      <w:r>
-        <w:rPr>
-          <w:sz w:val="28"/>
-          <w:lang w:val="en-US"/>
-        </w:rPr>
-        <w:t>&gt;</w:t>
-      </w:r>
-    </w:p>
-    <w:p>
-      <w:pPr>
-        <w:rPr>
-          <w:sz w:val="28"/>
-          <w:lang w:val="en-US"/>
-        </w:rPr>
-      </w:pPr>
-      <w:r>
-        <w:rPr>
-          <w:sz w:val="28"/>
-          <w:lang w:val="en-US"/>
-        </w:rPr>
-        <w:t xml:space="preserve">All tag written here </w:t>
-      </w:r>
-      <w:proofErr w:type="gramStart"/>
-      <w:r>
-        <w:rPr>
-          <w:sz w:val="28"/>
-          <w:lang w:val="en-US"/>
-        </w:rPr>
-        <w:t>are</w:t>
-      </w:r>
-      <w:proofErr w:type="gramEnd"/>
-      <w:r>
-        <w:rPr>
-          <w:sz w:val="28"/>
-          <w:lang w:val="en-US"/>
-        </w:rPr>
-        <w:t xml:space="preserve"> displayed to user. </w:t>
-      </w:r>
-    </w:p>
-    <w:p>
-      <w:pPr>
-        <w:rPr>
-          <w:sz w:val="28"/>
-          <w:lang w:val="en-US"/>
-        </w:rPr>
-      </w:pPr>
-      <w:r>
-        <w:rPr>
-          <w:sz w:val="28"/>
-          <w:lang w:val="en-US"/>
-        </w:rPr>
-        <w:tab/>
-        <w:t>&lt;/body&gt;</w:t>
-      </w:r>
-    </w:p>
-    <w:p>
-      <w:pPr>
-        <w:rPr>
-          <w:sz w:val="28"/>
-          <w:lang w:val="en-US"/>
-        </w:rPr>
-      </w:pPr>
-      <w:r>
-        <w:rPr>
-          <w:sz w:val="28"/>
-          <w:lang w:val="en-US"/>
-        </w:rPr>
-        <w:t xml:space="preserve">&lt;/html&gt; </w:t>
-      </w:r>
-    </w:p>
-    <w:p>
-      <w:pPr>
-        <w:rPr>
-          <w:sz w:val="28"/>
-          <w:lang w:val="en-US"/>
-        </w:rPr>
-      </w:pPr>
-      <w:r>
-        <w:rPr>
-          <w:sz w:val="28"/>
-          <w:lang w:val="en-US"/>
-        </w:rPr>
-        <w:t>&lt;</w:t>
-      </w:r>
-      <w:proofErr w:type="gramStart"/>
-      <w:r>
-        <w:rPr>
-          <w:sz w:val="28"/>
-          <w:lang w:val="en-US"/>
-        </w:rPr>
-        <w:t>script</w:t>
-      </w:r>
-      <w:proofErr w:type="gramEnd"/>
-      <w:r>
-        <w:rPr>
-          <w:sz w:val="28"/>
-          <w:lang w:val="en-US"/>
-        </w:rPr>
-        <w:t>&gt;&lt;/script&gt;</w:t>
-      </w:r>
-    </w:p>
-    <w:p>
-      <w:pPr>
-        <w:rPr>
-          <w:sz w:val="28"/>
-          <w:lang w:val="en-US"/>
-        </w:rPr>
-      </w:pPr>
-      <w:r>
-        <w:rPr>
-          <w:sz w:val="28"/>
-          <w:lang w:val="en-US"/>
-        </w:rPr>
-        <w:t xml:space="preserve">&lt;script </w:t>
-      </w:r>
-      <w:proofErr w:type="spellStart"/>
-      <w:r>
-        <w:rPr>
-          <w:sz w:val="28"/>
-          <w:lang w:val="en-US"/>
-        </w:rPr>
-        <w:t>src</w:t>
-      </w:r>
-      <w:proofErr w:type="spellEnd"/>
-      <w:r>
-        <w:rPr>
-          <w:sz w:val="28"/>
-          <w:lang w:val="en-US"/>
-        </w:rPr>
-        <w:t>=””&gt;&lt;/script&gt;</w:t>
-      </w:r>
-    </w:p>
-    <w:p>
-      <w:pPr>
-        <w:rPr>
-          <w:sz w:val="28"/>
-          <w:lang w:val="en-US"/>
-        </w:rPr>
-      </w:pPr>
     </w:p>
     <w:p>
       <w:pPr>

</xml_diff>

<commit_message>
commit for ppt and docx
</commit_message>
<xml_diff>
--- a/HTML_CSS.docx
+++ b/HTML_CSS.docx
@@ -1280,6 +1280,138 @@
           <w:lang w:val="en-US"/>
         </w:rPr>
       </w:pPr>
+    </w:p>
+    <w:p>
+      <w:pPr>
+        <w:rPr>
+          <w:sz w:val="28"/>
+          <w:lang w:val="en-US"/>
+        </w:rPr>
+      </w:pPr>
+      <w:r>
+        <w:rPr>
+          <w:sz w:val="28"/>
+          <w:lang w:val="en-US"/>
+        </w:rPr>
+        <w:t xml:space="preserve">CI/CD </w:t>
+      </w:r>
+    </w:p>
+    <w:p>
+      <w:pPr>
+        <w:rPr>
+          <w:sz w:val="28"/>
+          <w:lang w:val="en-US"/>
+        </w:rPr>
+      </w:pPr>
+      <w:r>
+        <w:rPr>
+          <w:sz w:val="28"/>
+          <w:lang w:val="en-US"/>
+        </w:rPr>
+        <w:t xml:space="preserve">Continuous integration and </w:t>
+      </w:r>
+      <w:r>
+        <w:rPr>
+          <w:sz w:val="28"/>
+          <w:lang w:val="en-US"/>
+        </w:rPr>
+        <w:t xml:space="preserve">Continuous </w:t>
+      </w:r>
+      <w:r>
+        <w:rPr>
+          <w:sz w:val="28"/>
+          <w:lang w:val="en-US"/>
+        </w:rPr>
+        <w:t xml:space="preserve">deployment </w:t>
+      </w:r>
+    </w:p>
+    <w:p>
+      <w:pPr>
+        <w:rPr>
+          <w:sz w:val="28"/>
+          <w:lang w:val="en-US"/>
+        </w:rPr>
+      </w:pPr>
+    </w:p>
+    <w:p>
+      <w:pPr>
+        <w:rPr>
+          <w:sz w:val="28"/>
+          <w:lang w:val="en-US"/>
+        </w:rPr>
+      </w:pPr>
+      <w:proofErr w:type="gramStart"/>
+      <w:r>
+        <w:rPr>
+          <w:sz w:val="28"/>
+          <w:lang w:val="en-US"/>
+        </w:rPr>
+        <w:t>Push  :-</w:t>
+      </w:r>
+      <w:proofErr w:type="gramEnd"/>
+      <w:r>
+        <w:rPr>
+          <w:sz w:val="28"/>
+          <w:lang w:val="en-US"/>
+        </w:rPr>
+        <w:t xml:space="preserve"> is use to send the files to remote repository  </w:t>
+      </w:r>
+    </w:p>
+    <w:p>
+      <w:pPr>
+        <w:rPr>
+          <w:sz w:val="28"/>
+          <w:lang w:val="en-US"/>
+        </w:rPr>
+      </w:pPr>
+      <w:proofErr w:type="gramStart"/>
+      <w:r>
+        <w:rPr>
+          <w:sz w:val="28"/>
+          <w:lang w:val="en-US"/>
+        </w:rPr>
+        <w:t>Pull :-</w:t>
+      </w:r>
+      <w:proofErr w:type="gramEnd"/>
+      <w:r>
+        <w:rPr>
+          <w:sz w:val="28"/>
+          <w:lang w:val="en-US"/>
+        </w:rPr>
+        <w:t xml:space="preserve"> it is combination of  fetch and merge </w:t>
+      </w:r>
+    </w:p>
+    <w:p>
+      <w:pPr>
+        <w:rPr>
+          <w:sz w:val="28"/>
+          <w:lang w:val="en-US"/>
+        </w:rPr>
+      </w:pPr>
+      <w:proofErr w:type="spellStart"/>
+      <w:r>
+        <w:rPr>
+          <w:sz w:val="28"/>
+          <w:lang w:val="en-US"/>
+        </w:rPr>
+        <w:t>Git</w:t>
+      </w:r>
+      <w:proofErr w:type="spellEnd"/>
+      <w:r>
+        <w:rPr>
+          <w:sz w:val="28"/>
+          <w:lang w:val="en-US"/>
+        </w:rPr>
+        <w:t xml:space="preserve"> diff origin/master</w:t>
+      </w:r>
+    </w:p>
+    <w:p>
+      <w:pPr>
+        <w:rPr>
+          <w:sz w:val="28"/>
+          <w:lang w:val="en-US"/>
+        </w:rPr>
+      </w:pPr>
       <w:bookmarkStart w:id="0" w:name="_GoBack"/>
       <w:bookmarkEnd w:id="0"/>
     </w:p>
@@ -1290,14 +1422,13 @@
           <w:lang w:val="en-US"/>
         </w:rPr>
       </w:pPr>
-    </w:p>
-    <w:p>
-      <w:pPr>
-        <w:rPr>
-          <w:sz w:val="28"/>
-          <w:lang w:val="en-US"/>
-        </w:rPr>
-      </w:pPr>
+      <w:r>
+        <w:rPr>
+          <w:sz w:val="28"/>
+          <w:lang w:val="en-US"/>
+        </w:rPr>
+        <w:t xml:space="preserve"> </w:t>
+      </w:r>
     </w:p>
     <w:p>
       <w:pPr>

</xml_diff>